<commit_message>
Book 1 cover in Canva, new pen name Luke Moreland, reading copy
- Pen name changes from Avery Ashcombe to Luke Moreland (the author's
  choice, built from his own name); rebuilt EPUB, DOCX, and print PDF.
- Ebook cover made in Canva (design DAHYpoQPBIk); KDP package records the
  link, download steps, and the AI-generated images disclosure.
- tools/reading_copy.py adds the cover as page 1 of a PDF reading copy,
  padding instead of stretching when the shapes differ.
- build_book.py embeds publishing/cover-ebook.jpg in the EPUB when present.

Co-Authored-By: Claude Opus 5.5 <noreply@anthropic.com>
Claude-Session: https://claude.ai/code/session_0125zWpiFYGL8HMT5KJ8xCtH
</commit_message>
<xml_diff>
--- a/fantasy-book-guide/my-series/publishing/The-Heart-Thread.docx
+++ b/fantasy-book-guide/my-series/publishing/The-Heart-Thread.docx
@@ -53,13 +53,13 @@
         <w:pStyle w:val="Author"/>
       </w:pPr>
       <w:r>
-        <w:t xml:space="preserve">Avery</w:t>
-      </w:r>
-      <w:r>
-        <w:t xml:space="preserve"> </w:t>
-      </w:r>
-      <w:r>
-        <w:t xml:space="preserve">Ashcombe</w:t>
+        <w:t xml:space="preserve">Luke</w:t>
+      </w:r>
+      <w:r>
+        <w:t xml:space="preserve"> </w:t>
+      </w:r>
+      <w:r>
+        <w:t xml:space="preserve">Moreland</w:t>
       </w:r>
     </w:p>
     <w:sdt>
@@ -102,7 +102,7 @@
         <w:pStyle w:val="FirstParagraph"/>
       </w:pPr>
       <w:r>
-        <w:t xml:space="preserve">Copyright © 2026 Avery Ashcombe. All rights reserved.</w:t>
+        <w:t xml:space="preserve">Copyright © 2026 Luke Moreland. All rights reserved.</w:t>
       </w:r>
     </w:p>
     <w:p>
@@ -46391,7 +46391,7 @@
         <w:pStyle w:val="FirstParagraph"/>
       </w:pPr>
       <w:r>
-        <w:t xml:space="preserve">Avery Ashcombe writes fantasy about oaths, magic, and the people brave enough to break the wrong ones.</w:t>
+        <w:t xml:space="preserve">Luke Moreland writes fantasy about oaths, magic, and the people brave enough to break the wrong ones.</w:t>
       </w:r>
       <w:r>
         <w:t xml:space="preserve"> </w:t>
@@ -46407,7 +46407,7 @@
         <w:t xml:space="preserve"> </w:t>
       </w:r>
       <w:r>
-        <w:t xml:space="preserve">is their first novel.</w:t>
+        <w:t xml:space="preserve">is his first novel.</w:t>
       </w:r>
     </w:p>
     <w:bookmarkEnd w:id="58"/>

</xml_diff>